<commit_message>
Changed README.md and added/deleted other files
</commit_message>
<xml_diff>
--- a/CPRE431/TeamEvaluation-formDownload.docx
+++ b/CPRE431/TeamEvaluation-formDownload.docx
@@ -15,17 +15,17 @@
     <w:tbl>
       <w:tblPr>
         <w:tblStyle w:val="TableGrid"/>
-        <w:tblW w:w="9681" w:type="dxa"/>
+        <w:tblW w:w="9445" w:type="dxa"/>
         <w:tblLook w:val="04A0" w:firstRow="1" w:lastRow="0" w:firstColumn="1" w:lastColumn="0" w:noHBand="0" w:noVBand="1"/>
       </w:tblPr>
       <w:tblGrid>
-        <w:gridCol w:w="3964"/>
-        <w:gridCol w:w="5717"/>
+        <w:gridCol w:w="1894"/>
+        <w:gridCol w:w="7551"/>
       </w:tblGrid>
       <w:tr>
         <w:tc>
           <w:tcPr>
-            <w:tcW w:w="3964" w:type="dxa"/>
+            <w:tcW w:w="1894" w:type="dxa"/>
             <w:tcBorders>
               <w:right w:val="nil"/>
             </w:tcBorders>
@@ -64,14 +64,7 @@
                 <w:bCs/>
                 <w:color w:val="000000" w:themeColor="text1"/>
               </w:rPr>
-              <w:t xml:space="preserve"> </w:t>
-            </w:r>
-            <w:r>
-              <w:rPr>
-                <w:rFonts w:cstheme="minorHAnsi"/>
-                <w:color w:val="000000" w:themeColor="text1"/>
-              </w:rPr>
-              <w:t>02</w:t>
+              <w:t xml:space="preserve"> 2</w:t>
             </w:r>
           </w:p>
           <w:p>
@@ -87,7 +80,7 @@
         </w:tc>
         <w:tc>
           <w:tcPr>
-            <w:tcW w:w="5717" w:type="dxa"/>
+            <w:tcW w:w="7551" w:type="dxa"/>
             <w:tcBorders>
               <w:left w:val="nil"/>
             </w:tcBorders>
@@ -121,7 +114,7 @@
       <w:tr>
         <w:tc>
           <w:tcPr>
-            <w:tcW w:w="3964" w:type="dxa"/>
+            <w:tcW w:w="1894" w:type="dxa"/>
             <w:tcBorders>
               <w:right w:val="nil"/>
             </w:tcBorders>
@@ -130,6 +123,8 @@
             <w:pPr>
               <w:rPr>
                 <w:rFonts w:cstheme="minorHAnsi"/>
+                <w:b/>
+                <w:bCs/>
                 <w:color w:val="000000" w:themeColor="text1"/>
               </w:rPr>
             </w:pPr>
@@ -140,7 +135,7 @@
                 <w:bCs/>
                 <w:color w:val="000000" w:themeColor="text1"/>
               </w:rPr>
-              <w:t>Lab Section:</w:t>
+              <w:t xml:space="preserve">My Name: </w:t>
             </w:r>
             <w:r>
               <w:rPr>
@@ -149,14 +144,7 @@
                 <w:bCs/>
                 <w:color w:val="000000" w:themeColor="text1"/>
               </w:rPr>
-              <w:t xml:space="preserve"> </w:t>
-            </w:r>
-            <w:r>
-              <w:rPr>
-                <w:rFonts w:cstheme="minorHAnsi"/>
-                <w:color w:val="000000" w:themeColor="text1"/>
-              </w:rPr>
-              <w:t>A</w:t>
+              <w:t>Gurumanie Singh Dhiman</w:t>
             </w:r>
           </w:p>
           <w:p>
@@ -172,85 +160,7 @@
         </w:tc>
         <w:tc>
           <w:tcPr>
-            <w:tcW w:w="5717" w:type="dxa"/>
-            <w:tcBorders>
-              <w:left w:val="nil"/>
-            </w:tcBorders>
-          </w:tcPr>
-          <w:p>
-            <w:pPr>
-              <w:rPr>
-                <w:rFonts w:cstheme="minorHAnsi"/>
-                <w:color w:val="000000" w:themeColor="text1"/>
-              </w:rPr>
-            </w:pPr>
-          </w:p>
-          <w:p>
-            <w:pPr>
-              <w:rPr>
-                <w:rFonts w:cstheme="minorHAnsi"/>
-                <w:color w:val="000000" w:themeColor="text1"/>
-              </w:rPr>
-            </w:pPr>
-          </w:p>
-          <w:p>
-            <w:pPr>
-              <w:rPr>
-                <w:rFonts w:cstheme="minorHAnsi"/>
-                <w:color w:val="000000" w:themeColor="text1"/>
-              </w:rPr>
-            </w:pPr>
-          </w:p>
-        </w:tc>
-      </w:tr>
-      <w:tr>
-        <w:tc>
-          <w:tcPr>
-            <w:tcW w:w="3964" w:type="dxa"/>
-            <w:tcBorders>
-              <w:right w:val="nil"/>
-            </w:tcBorders>
-          </w:tcPr>
-          <w:p>
-            <w:pPr>
-              <w:rPr>
-                <w:rFonts w:cstheme="minorHAnsi"/>
-                <w:b/>
-                <w:bCs/>
-                <w:color w:val="000000" w:themeColor="text1"/>
-              </w:rPr>
-            </w:pPr>
-            <w:r>
-              <w:rPr>
-                <w:rFonts w:cstheme="minorHAnsi"/>
-                <w:b/>
-                <w:bCs/>
-                <w:color w:val="000000" w:themeColor="text1"/>
-              </w:rPr>
-              <w:t xml:space="preserve">My Name: </w:t>
-            </w:r>
-            <w:r>
-              <w:rPr>
-                <w:rFonts w:cstheme="minorHAnsi"/>
-                <w:color w:val="000000" w:themeColor="text1"/>
-              </w:rPr>
-              <w:t>Gurumanie Singh Dhiman</w:t>
-            </w:r>
-          </w:p>
-          <w:p>
-            <w:pPr>
-              <w:rPr>
-                <w:rFonts w:cstheme="minorHAnsi"/>
-                <w:b/>
-                <w:bCs/>
-                <w:color w:val="000000" w:themeColor="text1"/>
-              </w:rPr>
-            </w:pPr>
-          </w:p>
-        </w:tc>
-        <w:tc>
-          <w:tcPr>
-            <w:tcW w:w="5717" w:type="dxa"/>
+            <w:tcW w:w="7551" w:type="dxa"/>
             <w:tcBorders>
               <w:left w:val="nil"/>
             </w:tcBorders>
@@ -346,7 +256,33 @@
         <w:t>). Total the numbers in each column.</w:t>
       </w:r>
     </w:p>
-    <w:p/>
+    <w:p>
+      <w:pPr>
+        <w:rPr>
+          <w:color w:val="EE0000"/>
+        </w:rPr>
+      </w:pPr>
+      <w:r>
+        <w:rPr>
+          <w:color w:val="EE0000"/>
+        </w:rPr>
+        <w:t xml:space="preserve">When evaluating your teammates, </w:t>
+      </w:r>
+      <w:r>
+        <w:rPr>
+          <w:i/>
+          <w:iCs/>
+          <w:color w:val="EE0000"/>
+        </w:rPr>
+        <w:t>you may not assign identical scores to all team members</w:t>
+      </w:r>
+      <w:r>
+        <w:rPr>
+          <w:color w:val="EE0000"/>
+        </w:rPr>
+        <w:t>. Each team member’s score should reflect real differences in contribution, engagement, effort, and performance. Please evaluate each person individually based on their actual contributions to the project.</w:t>
+      </w:r>
+    </w:p>
     <w:p/>
     <w:p/>
     <w:p/>
@@ -370,6 +306,7 @@
           </w:tcPr>
           <w:p>
             <w:r>
+              <w:lastRenderedPageBreak/>
               <w:t>Evaluation Criteria</w:t>
             </w:r>
           </w:p>
@@ -390,9 +327,6 @@
           <w:p>
             <w:r>
               <w:t>Myself:</w:t>
-            </w:r>
-            <w:r>
-              <w:t xml:space="preserve"> Gurumanie Singh Dhiman</w:t>
             </w:r>
           </w:p>
           <w:p/>
@@ -415,7 +349,7 @@
           </w:p>
           <w:p>
             <w:r>
-              <w:t>Gavin Nienke</w:t>
+              <w:t>Cameron</w:t>
             </w:r>
           </w:p>
           <w:p/>
@@ -437,7 +371,7 @@
           </w:p>
           <w:p>
             <w:r>
-              <w:t>Shiv Patel</w:t>
+              <w:t>Gavin</w:t>
             </w:r>
           </w:p>
           <w:p/>
@@ -481,7 +415,7 @@
           </w:tcPr>
           <w:p>
             <w:r>
-              <w:t>3</w:t>
+              <w:t>4</w:t>
             </w:r>
           </w:p>
         </w:tc>
@@ -524,7 +458,7 @@
           </w:tcPr>
           <w:p>
             <w:r>
-              <w:t>4</w:t>
+              <w:t>3</w:t>
             </w:r>
           </w:p>
         </w:tc>
@@ -763,7 +697,7 @@
           </w:p>
           <w:p>
             <w:r>
-              <w:t>Cameron Schweder</w:t>
+              <w:t>Owais</w:t>
             </w:r>
           </w:p>
         </w:tc>
@@ -784,7 +718,7 @@
           </w:p>
           <w:p>
             <w:r>
-              <w:t>Eli Newland</w:t>
+              <w:t>Shivansh</w:t>
             </w:r>
           </w:p>
           <w:p/>
@@ -804,11 +738,7 @@
               <w:t>:</w:t>
             </w:r>
           </w:p>
-          <w:p>
-            <w:r>
-              <w:t>Owais Samman</w:t>
-            </w:r>
-          </w:p>
+          <w:p/>
           <w:p/>
         </w:tc>
       </w:tr>
@@ -840,7 +770,7 @@
           </w:tcPr>
           <w:p>
             <w:r>
-              <w:t>4</w:t>
+              <w:t>3</w:t>
             </w:r>
           </w:p>
         </w:tc>
@@ -848,11 +778,7 @@
           <w:tcPr>
             <w:tcW w:w="2070" w:type="dxa"/>
           </w:tcPr>
-          <w:p>
-            <w:r>
-              <w:t>4</w:t>
-            </w:r>
-          </w:p>
+          <w:p/>
         </w:tc>
       </w:tr>
       <w:tr>
@@ -891,11 +817,7 @@
           <w:tcPr>
             <w:tcW w:w="2070" w:type="dxa"/>
           </w:tcPr>
-          <w:p>
-            <w:r>
-              <w:t>4</w:t>
-            </w:r>
-          </w:p>
+          <w:p/>
         </w:tc>
       </w:tr>
       <w:tr>
@@ -926,7 +848,7 @@
           </w:tcPr>
           <w:p>
             <w:r>
-              <w:t>4</w:t>
+              <w:t>3</w:t>
             </w:r>
           </w:p>
         </w:tc>
@@ -934,11 +856,7 @@
           <w:tcPr>
             <w:tcW w:w="2070" w:type="dxa"/>
           </w:tcPr>
-          <w:p>
-            <w:r>
-              <w:t>4</w:t>
-            </w:r>
-          </w:p>
+          <w:p/>
         </w:tc>
       </w:tr>
       <w:tr>
@@ -977,11 +895,7 @@
           <w:tcPr>
             <w:tcW w:w="2070" w:type="dxa"/>
           </w:tcPr>
-          <w:p>
-            <w:r>
-              <w:t>4</w:t>
-            </w:r>
-          </w:p>
+          <w:p/>
         </w:tc>
       </w:tr>
       <w:tr>
@@ -1020,11 +934,7 @@
           <w:tcPr>
             <w:tcW w:w="2070" w:type="dxa"/>
           </w:tcPr>
-          <w:p>
-            <w:r>
-              <w:t>4</w:t>
-            </w:r>
-          </w:p>
+          <w:p/>
         </w:tc>
       </w:tr>
       <w:tr>
@@ -1066,7 +976,7 @@
           </w:tcPr>
           <w:p>
             <w:r>
-              <w:t>20</w:t>
+              <w:t>18</w:t>
             </w:r>
           </w:p>
         </w:tc>
@@ -1074,11 +984,7 @@
           <w:tcPr>
             <w:tcW w:w="2070" w:type="dxa"/>
           </w:tcPr>
-          <w:p>
-            <w:r>
-              <w:t>20</w:t>
-            </w:r>
-          </w:p>
+          <w:p/>
         </w:tc>
       </w:tr>
     </w:tbl>
@@ -1095,6 +1001,7 @@
         <w:spacing w:after="0" w:line="240" w:lineRule="auto"/>
       </w:pPr>
       <w:r>
+        <w:lastRenderedPageBreak/>
         <w:t xml:space="preserve">Describe your most significant contribution to </w:t>
       </w:r>
       <w:r>
@@ -1103,10 +1010,15 @@
     </w:p>
     <w:p/>
     <w:p>
+      <w:pPr>
+        <w:ind w:left="360"/>
+      </w:pPr>
       <w:r>
-        <w:t>When we had our first ever call to discuss about our presentation, I guided the team on what each slide should say and provided a format for all of us to use. I also recommended additional sections when nobody else seemed to have any ideas for the slides since we had 6 members and were hoping for each member to have at least 2 slides to present.</w:t>
+        <w:t>Coming up with the idea for the final project. Although we ended up going with someone else’s idea in the end. Additionally, finished drafting the report introduction, overview and presentation slides for the entire team along with my sections.</w:t>
       </w:r>
     </w:p>
+    <w:p/>
+    <w:p/>
     <w:p>
       <w:pPr>
         <w:pStyle w:val="ListParagraph"/>
@@ -1126,6 +1038,177 @@
         <w:t xml:space="preserve"> that you will carry into your next group experience.</w:t>
       </w:r>
     </w:p>
+    <w:p>
+      <w:pPr>
+        <w:pStyle w:val="ListParagraph"/>
+        <w:spacing w:after="0" w:line="240" w:lineRule="auto"/>
+        <w:ind w:left="360"/>
+      </w:pPr>
+    </w:p>
+    <w:p>
+      <w:pPr>
+        <w:pStyle w:val="ListParagraph"/>
+        <w:spacing w:after="0" w:line="240" w:lineRule="auto"/>
+        <w:ind w:left="360"/>
+      </w:pPr>
+      <w:r>
+        <w:t>I liked how respectful everyone was when coming up with their ideas. Even those who did not have any ideas tried to contribute by adding onto someone else’s ideas that were brought up.</w:t>
+      </w:r>
+    </w:p>
+    <w:p>
+      <w:pPr>
+        <w:pStyle w:val="ListParagraph"/>
+        <w:spacing w:after="0" w:line="240" w:lineRule="auto"/>
+        <w:ind w:left="360"/>
+      </w:pPr>
+    </w:p>
+    <w:p>
+      <w:pPr>
+        <w:pStyle w:val="ListParagraph"/>
+        <w:spacing w:after="0" w:line="240" w:lineRule="auto"/>
+        <w:ind w:left="360"/>
+      </w:pPr>
+    </w:p>
+    <w:p>
+      <w:pPr>
+        <w:pStyle w:val="ListParagraph"/>
+        <w:spacing w:after="0" w:line="240" w:lineRule="auto"/>
+        <w:ind w:left="360"/>
+      </w:pPr>
+    </w:p>
+    <w:p>
+      <w:pPr>
+        <w:pStyle w:val="ListParagraph"/>
+        <w:spacing w:after="0" w:line="240" w:lineRule="auto"/>
+        <w:ind w:left="360"/>
+      </w:pPr>
+    </w:p>
+    <w:p>
+      <w:pPr>
+        <w:pStyle w:val="ListParagraph"/>
+        <w:spacing w:after="0" w:line="240" w:lineRule="auto"/>
+        <w:ind w:left="360"/>
+      </w:pPr>
+    </w:p>
+    <w:p>
+      <w:pPr>
+        <w:pStyle w:val="ListParagraph"/>
+      </w:pPr>
+    </w:p>
+    <w:p>
+      <w:pPr>
+        <w:pStyle w:val="ListParagraph"/>
+        <w:numPr>
+          <w:ilvl w:val="0"/>
+          <w:numId w:val="40"/>
+        </w:numPr>
+        <w:spacing w:after="0" w:line="240" w:lineRule="auto"/>
+      </w:pPr>
+      <w:r>
+        <w:t>Highest Contributor Name:</w:t>
+      </w:r>
+      <w:r>
+        <w:t xml:space="preserve"> Cameron</w:t>
+      </w:r>
+    </w:p>
+    <w:p>
+      <w:pPr>
+        <w:pStyle w:val="ListParagraph"/>
+        <w:spacing w:after="0" w:line="240" w:lineRule="auto"/>
+        <w:ind w:left="360"/>
+      </w:pPr>
+    </w:p>
+    <w:p>
+      <w:pPr>
+        <w:pStyle w:val="ListParagraph"/>
+        <w:spacing w:after="0" w:line="240" w:lineRule="auto"/>
+        <w:ind w:left="360"/>
+      </w:pPr>
+      <w:r>
+        <w:t>Reason for selecting this person:</w:t>
+      </w:r>
+      <w:r>
+        <w:t xml:space="preserve"> Helped me take over some presentation slides since mine were already hitting 2mins and 30 seconds.</w:t>
+      </w:r>
+    </w:p>
+    <w:p>
+      <w:pPr>
+        <w:pStyle w:val="ListParagraph"/>
+        <w:spacing w:after="0" w:line="240" w:lineRule="auto"/>
+        <w:ind w:left="360"/>
+      </w:pPr>
+    </w:p>
+    <w:p>
+      <w:pPr>
+        <w:pStyle w:val="ListParagraph"/>
+        <w:spacing w:after="0" w:line="240" w:lineRule="auto"/>
+        <w:ind w:left="360"/>
+      </w:pPr>
+    </w:p>
+    <w:p>
+      <w:pPr>
+        <w:pStyle w:val="ListParagraph"/>
+        <w:spacing w:after="0" w:line="240" w:lineRule="auto"/>
+        <w:ind w:left="360"/>
+      </w:pPr>
+    </w:p>
+    <w:p>
+      <w:pPr>
+        <w:pStyle w:val="ListParagraph"/>
+        <w:spacing w:after="0" w:line="240" w:lineRule="auto"/>
+        <w:ind w:left="360"/>
+      </w:pPr>
+    </w:p>
+    <w:p>
+      <w:pPr>
+        <w:pStyle w:val="ListParagraph"/>
+        <w:spacing w:after="0" w:line="240" w:lineRule="auto"/>
+        <w:ind w:left="360"/>
+      </w:pPr>
+    </w:p>
+    <w:p>
+      <w:pPr>
+        <w:pStyle w:val="ListParagraph"/>
+        <w:spacing w:after="0" w:line="240" w:lineRule="auto"/>
+        <w:ind w:left="360"/>
+      </w:pPr>
+    </w:p>
+    <w:p>
+      <w:pPr>
+        <w:pStyle w:val="ListParagraph"/>
+        <w:numPr>
+          <w:ilvl w:val="0"/>
+          <w:numId w:val="40"/>
+        </w:numPr>
+        <w:spacing w:after="0" w:line="240" w:lineRule="auto"/>
+      </w:pPr>
+      <w:r>
+        <w:t>Lowest Contributor Name:</w:t>
+      </w:r>
+      <w:r>
+        <w:t xml:space="preserve"> Shivansh</w:t>
+      </w:r>
+    </w:p>
+    <w:p>
+      <w:pPr>
+        <w:pStyle w:val="ListParagraph"/>
+        <w:spacing w:after="0" w:line="240" w:lineRule="auto"/>
+        <w:ind w:left="360"/>
+      </w:pPr>
+    </w:p>
+    <w:p>
+      <w:pPr>
+        <w:pStyle w:val="ListParagraph"/>
+        <w:spacing w:after="0" w:line="240" w:lineRule="auto"/>
+        <w:ind w:left="360"/>
+      </w:pPr>
+      <w:r>
+        <w:t>Reason for selecting this person:</w:t>
+      </w:r>
+      <w:r>
+        <w:t xml:space="preserve"> He finished his part of the project, however he delayed starting it until the last day. (Had me a little worried that he might not finish his section of the report/presentation)</w:t>
+      </w:r>
+    </w:p>
     <w:p/>
     <w:p>
       <w:pPr>
@@ -1134,20 +1217,13 @@
           <w:color w:val="000000" w:themeColor="text1"/>
         </w:rPr>
       </w:pPr>
-      <w:r>
+    </w:p>
+    <w:p>
+      <w:pPr>
         <w:rPr>
           <w:rFonts w:cstheme="minorHAnsi"/>
           <w:color w:val="000000" w:themeColor="text1"/>
         </w:rPr>
-        <w:t>I think I found it quite fascinating that all it took was 45 minutes for us to sort out who is doing which part for the presentation and discuss all the slides that will be needed. It was great to see how fast and smooth things can go in groups when everyone is respectful but also provides their own unique inputs. I found that to be my learning moment, when I realized that if all group meetings were as respectful and eager to listen as this group, things would move at a much quicker pace without much hassle.</w:t>
-      </w:r>
-    </w:p>
-    <w:p>
-      <w:pPr>
-        <w:rPr>
-          <w:rFonts w:cstheme="minorHAnsi"/>
-          <w:color w:val="000000" w:themeColor="text1"/>
-        </w:rPr>
       </w:pPr>
     </w:p>
     <w:p>
@@ -1156,75 +1232,6 @@
           <w:color w:val="000000" w:themeColor="text1"/>
         </w:rPr>
       </w:pPr>
-    </w:p>
-    <w:p>
-      <w:pPr>
-        <w:rPr>
-          <w:color w:val="000000" w:themeColor="text1"/>
-        </w:rPr>
-      </w:pPr>
-    </w:p>
-    <w:p>
-      <w:pPr>
-        <w:rPr>
-          <w:color w:val="000000" w:themeColor="text1"/>
-        </w:rPr>
-      </w:pPr>
-    </w:p>
-    <w:p>
-      <w:pPr>
-        <w:rPr>
-          <w:color w:val="000000" w:themeColor="text1"/>
-        </w:rPr>
-      </w:pPr>
-    </w:p>
-    <w:p>
-      <w:pPr>
-        <w:rPr>
-          <w:color w:val="000000" w:themeColor="text1"/>
-        </w:rPr>
-      </w:pPr>
-    </w:p>
-    <w:p>
-      <w:pPr>
-        <w:rPr>
-          <w:color w:val="000000" w:themeColor="text1"/>
-        </w:rPr>
-      </w:pPr>
-    </w:p>
-    <w:p>
-      <w:pPr>
-        <w:rPr>
-          <w:color w:val="000000" w:themeColor="text1"/>
-        </w:rPr>
-      </w:pPr>
-    </w:p>
-    <w:p>
-      <w:pPr>
-        <w:rPr>
-          <w:color w:val="000000" w:themeColor="text1"/>
-        </w:rPr>
-      </w:pPr>
-    </w:p>
-    <w:p>
-      <w:pPr>
-        <w:rPr>
-          <w:color w:val="000000" w:themeColor="text1"/>
-        </w:rPr>
-      </w:pPr>
-    </w:p>
-    <w:p>
-      <w:pPr>
-        <w:rPr>
-          <w:color w:val="000000" w:themeColor="text1"/>
-        </w:rPr>
-      </w:pPr>
-      <w:r>
-        <w:rPr>
-          <w:color w:val="000000" w:themeColor="text1"/>
-        </w:rPr>
-        <w:t>Thanks for filling out the survey. Please convert this document to pdf and submit it to Canvas.</w:t>
-      </w:r>
     </w:p>
     <w:sectPr>
       <w:footerReference w:type="even" r:id="rId8"/>
@@ -1484,7 +1491,7 @@
             </wp:anchor>
           </w:drawing>
         </mc:Choice>
-        <mc:Fallback xmlns:mv="urn:schemas-microsoft-com:mac:vml" xmlns:mo="http://schemas.microsoft.com/office/mac/office/2008/main" xmlns:a="http://schemas.openxmlformats.org/drawingml/2006/main">
+        <mc:Fallback xmlns:a="http://schemas.openxmlformats.org/drawingml/2006/main" xmlns:mo="http://schemas.microsoft.com/office/mac/office/2008/main" xmlns:mv="urn:schemas-microsoft-com:mac:vml">
           <w:pict>
             <v:line id="Straight Connector 6" style="position:absolute;flip:y;z-index:251660288;visibility:visible;mso-wrap-style:square;mso-width-percent:0;mso-height-percent:0;mso-wrap-distance-left:9pt;mso-wrap-distance-top:0;mso-wrap-distance-right:9pt;mso-wrap-distance-bottom:0;mso-position-horizontal:absolute;mso-position-horizontal-relative:page;mso-position-vertical:absolute;mso-position-vertical-relative:page;mso-width-percent:0;mso-height-percent:0;mso-width-relative:margin;mso-height-relative:margin" alt="Title: Line design element" o:spid="_x0000_s1026" strokecolor="#eeece1 [3214]" strokeweight="1pt" from="63.25pt,702.2pt" to="541.55pt,702.45pt" w14:anchorId="49779121" o:gfxdata="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">
               <w10:wrap anchorx="page" anchory="page"/>
@@ -1590,8 +1597,17 @@
         <w:p>
           <w:pPr>
             <w:pStyle w:val="CompanyName"/>
+            <w:jc w:val="center"/>
+            <w:rPr>
+              <w:sz w:val="48"/>
+              <w:szCs w:val="20"/>
+            </w:rPr>
           </w:pPr>
           <w:r>
+            <w:rPr>
+              <w:sz w:val="48"/>
+              <w:szCs w:val="20"/>
+            </w:rPr>
             <w:t>Peer Evaluations (Individual Assignment)</w:t>
           </w:r>
         </w:p>
@@ -5668,124 +5684,124 @@
       </w:pPr>
     </w:lvl>
   </w:abstractNum>
-  <w:num w:numId="1" w16cid:durableId="611740274">
+  <w:num w:numId="1" w16cid:durableId="1689215904">
     <w:abstractNumId w:val="5"/>
   </w:num>
-  <w:num w:numId="2" w16cid:durableId="1559197373">
+  <w:num w:numId="2" w16cid:durableId="705758112">
     <w:abstractNumId w:val="18"/>
   </w:num>
-  <w:num w:numId="3" w16cid:durableId="347106149">
+  <w:num w:numId="3" w16cid:durableId="116072721">
     <w:abstractNumId w:val="13"/>
   </w:num>
-  <w:num w:numId="4" w16cid:durableId="1330135814">
+  <w:num w:numId="4" w16cid:durableId="337001997">
     <w:abstractNumId w:val="9"/>
   </w:num>
-  <w:num w:numId="5" w16cid:durableId="1204900039">
+  <w:num w:numId="5" w16cid:durableId="1090926337">
     <w:abstractNumId w:val="24"/>
   </w:num>
-  <w:num w:numId="6" w16cid:durableId="687559755">
+  <w:num w:numId="6" w16cid:durableId="1811940951">
     <w:abstractNumId w:val="8"/>
   </w:num>
-  <w:num w:numId="7" w16cid:durableId="518474398">
+  <w:num w:numId="7" w16cid:durableId="33118145">
     <w:abstractNumId w:val="25"/>
   </w:num>
-  <w:num w:numId="8" w16cid:durableId="337541467">
+  <w:num w:numId="8" w16cid:durableId="654725082">
     <w:abstractNumId w:val="17"/>
   </w:num>
-  <w:num w:numId="9" w16cid:durableId="1054893337">
+  <w:num w:numId="9" w16cid:durableId="336689177">
     <w:abstractNumId w:val="12"/>
   </w:num>
-  <w:num w:numId="10" w16cid:durableId="1504667374">
+  <w:num w:numId="10" w16cid:durableId="1617326291">
     <w:abstractNumId w:val="33"/>
   </w:num>
-  <w:num w:numId="11" w16cid:durableId="1633825262">
+  <w:num w:numId="11" w16cid:durableId="1691645674">
     <w:abstractNumId w:val="7"/>
   </w:num>
-  <w:num w:numId="12" w16cid:durableId="1460757059">
+  <w:num w:numId="12" w16cid:durableId="530842004">
     <w:abstractNumId w:val="31"/>
   </w:num>
-  <w:num w:numId="13" w16cid:durableId="725450699">
+  <w:num w:numId="13" w16cid:durableId="1267810719">
     <w:abstractNumId w:val="19"/>
   </w:num>
-  <w:num w:numId="14" w16cid:durableId="1743866633">
+  <w:num w:numId="14" w16cid:durableId="937834811">
     <w:abstractNumId w:val="34"/>
   </w:num>
-  <w:num w:numId="15" w16cid:durableId="186529270">
+  <w:num w:numId="15" w16cid:durableId="565145341">
     <w:abstractNumId w:val="29"/>
   </w:num>
-  <w:num w:numId="16" w16cid:durableId="933047977">
+  <w:num w:numId="16" w16cid:durableId="1117334859">
     <w:abstractNumId w:val="2"/>
   </w:num>
-  <w:num w:numId="17" w16cid:durableId="224680003">
+  <w:num w:numId="17" w16cid:durableId="2077244061">
     <w:abstractNumId w:val="37"/>
   </w:num>
-  <w:num w:numId="18" w16cid:durableId="152066912">
+  <w:num w:numId="18" w16cid:durableId="2131582682">
     <w:abstractNumId w:val="30"/>
   </w:num>
-  <w:num w:numId="19" w16cid:durableId="279605179">
+  <w:num w:numId="19" w16cid:durableId="562184658">
     <w:abstractNumId w:val="36"/>
   </w:num>
-  <w:num w:numId="20" w16cid:durableId="1662270276">
+  <w:num w:numId="20" w16cid:durableId="4746006">
     <w:abstractNumId w:val="22"/>
   </w:num>
-  <w:num w:numId="21" w16cid:durableId="1234850463">
+  <w:num w:numId="21" w16cid:durableId="396318041">
     <w:abstractNumId w:val="10"/>
   </w:num>
-  <w:num w:numId="22" w16cid:durableId="993340059">
+  <w:num w:numId="22" w16cid:durableId="969240577">
     <w:abstractNumId w:val="23"/>
   </w:num>
-  <w:num w:numId="23" w16cid:durableId="1756781088">
+  <w:num w:numId="23" w16cid:durableId="1675263159">
     <w:abstractNumId w:val="16"/>
   </w:num>
-  <w:num w:numId="24" w16cid:durableId="299655662">
+  <w:num w:numId="24" w16cid:durableId="683286044">
     <w:abstractNumId w:val="20"/>
   </w:num>
-  <w:num w:numId="25" w16cid:durableId="821965763">
+  <w:num w:numId="25" w16cid:durableId="1609921269">
     <w:abstractNumId w:val="14"/>
   </w:num>
-  <w:num w:numId="26" w16cid:durableId="1038435679">
+  <w:num w:numId="26" w16cid:durableId="1502310756">
     <w:abstractNumId w:val="39"/>
   </w:num>
-  <w:num w:numId="27" w16cid:durableId="1195537875">
+  <w:num w:numId="27" w16cid:durableId="2104034043">
     <w:abstractNumId w:val="21"/>
   </w:num>
-  <w:num w:numId="28" w16cid:durableId="582418917">
+  <w:num w:numId="28" w16cid:durableId="1317801882">
     <w:abstractNumId w:val="3"/>
   </w:num>
-  <w:num w:numId="29" w16cid:durableId="1045329234">
+  <w:num w:numId="29" w16cid:durableId="1469738186">
     <w:abstractNumId w:val="27"/>
   </w:num>
-  <w:num w:numId="30" w16cid:durableId="651908890">
+  <w:num w:numId="30" w16cid:durableId="1376588922">
     <w:abstractNumId w:val="11"/>
   </w:num>
-  <w:num w:numId="31" w16cid:durableId="233974113">
+  <w:num w:numId="31" w16cid:durableId="1911429653">
     <w:abstractNumId w:val="32"/>
   </w:num>
-  <w:num w:numId="32" w16cid:durableId="1250849325">
+  <w:num w:numId="32" w16cid:durableId="767969066">
     <w:abstractNumId w:val="15"/>
   </w:num>
-  <w:num w:numId="33" w16cid:durableId="1352486480">
+  <w:num w:numId="33" w16cid:durableId="126315466">
     <w:abstractNumId w:val="1"/>
   </w:num>
-  <w:num w:numId="34" w16cid:durableId="1144199374">
+  <w:num w:numId="34" w16cid:durableId="1846746259">
     <w:abstractNumId w:val="0"/>
   </w:num>
-  <w:num w:numId="35" w16cid:durableId="1325090550">
+  <w:num w:numId="35" w16cid:durableId="2107383065">
     <w:abstractNumId w:val="35"/>
   </w:num>
-  <w:num w:numId="36" w16cid:durableId="485975469">
+  <w:num w:numId="36" w16cid:durableId="1388264176">
     <w:abstractNumId w:val="4"/>
   </w:num>
-  <w:num w:numId="37" w16cid:durableId="1582370231">
+  <w:num w:numId="37" w16cid:durableId="1286352909">
     <w:abstractNumId w:val="26"/>
   </w:num>
-  <w:num w:numId="38" w16cid:durableId="1929803864">
+  <w:num w:numId="38" w16cid:durableId="241649577">
     <w:abstractNumId w:val="28"/>
   </w:num>
-  <w:num w:numId="39" w16cid:durableId="841699948">
+  <w:num w:numId="39" w16cid:durableId="703600795">
     <w:abstractNumId w:val="6"/>
   </w:num>
-  <w:num w:numId="40" w16cid:durableId="1900899692">
+  <w:num w:numId="40" w16cid:durableId="904218086">
     <w:abstractNumId w:val="38"/>
   </w:num>
 </w:numbering>

</xml_diff>